<commit_message>
Polish visual showcase pagination and output quality
</commit_message>
<xml_diff>
--- a/site/generated/visual-assets-showcase.docx
+++ b/site/generated/visual-assets-showcase.docx
@@ -6,6 +6,7 @@
       <w:pPr>
         <w:jc w:val="center"/>
         <w:spacing w:before="240" w:after="120"/>
+        <w:keepNext/>
       </w:pPr>
       <w:r>
         <w:rPr>
@@ -22,6 +23,7 @@
       <w:pPr>
         <w:jc w:val="center"/>
         <w:spacing w:after="280"/>
+        <w:keepNext/>
       </w:pPr>
       <w:r>
         <w:rPr>
@@ -34,6 +36,9 @@
       </w:r>
     </w:p>
     <w:p>
+      <w:pPr>
+        <w:jc w:val="center"/>
+      </w:pPr>
       <w:r>
         <w:drawing>
           <wp:inline distT="0" distB="0" distL="0" distR="0">
@@ -74,6 +79,7 @@
     <w:p>
       <w:pPr>
         <w:spacing w:before="220" w:after="90"/>
+        <w:keepNext/>
       </w:pPr>
       <w:r>
         <w:rPr>
@@ -90,6 +96,7 @@
     <w:p>
       <w:pPr>
         <w:spacing w:after="100"/>
+        <w:keepNext/>
       </w:pPr>
       <w:r>
         <w:rPr>
@@ -108,7 +115,7 @@
       <w:r>
         <w:drawing>
           <wp:inline distT="0" distB="0" distL="0" distR="0">
-            <wp:extent cx="4572000" cy="3004185"/>
+            <wp:extent cx="3556000" cy="2336800"/>
             <wp:docPr id="2" name="RusDox Image 2" descr="RusDox template gallery montage"/>
             <wp:cNvGraphicFramePr>
               <a:graphicFrameLocks noChangeAspect="1"/>
@@ -129,7 +136,7 @@
                   <pic:spPr>
                     <a:xfrm>
                       <a:off x="0" y="0"/>
-                      <a:ext cx="4572000" cy="3004185"/>
+                      <a:ext cx="3556000" cy="2336800"/>
                     </a:xfrm>
                     <a:prstGeom prst="rect">
                       <a:avLst/>
@@ -145,6 +152,7 @@
     <w:p>
       <w:pPr>
         <w:spacing w:before="220" w:after="90"/>
+        <w:keepNext/>
       </w:pPr>
       <w:r>
         <w:rPr>
@@ -161,6 +169,7 @@
     <w:p>
       <w:pPr>
         <w:spacing w:after="100"/>
+        <w:keepNext/>
       </w:pPr>
       <w:r>
         <w:rPr>
@@ -169,7 +178,7 @@
           <w:szCs w:val="22"/>
           <w:rFonts w:ascii="Arial" w:hAnsi="Arial" w:cs="Arial"/>
         </w:rPr>
-        <w:t>SVG chart files now flow through the same document pipeline and render into both DOCX and PDF outputs.</w:t>
+        <w:t>SVG chart assets now render cleanly in both DOCX and PDF outputs.</w:t>
       </w:r>
     </w:p>
     <w:p>
@@ -179,7 +188,7 @@
       <w:r>
         <w:drawing>
           <wp:inline distT="0" distB="0" distL="0" distR="0">
-            <wp:extent cx="4572000" cy="2362200"/>
+            <wp:extent cx="3048000" cy="1574800"/>
             <wp:docPr id="3" name="RusDox Chart 3" descr="RusDox 1000-page benchmark chart"/>
             <wp:cNvGraphicFramePr>
               <a:graphicFrameLocks noChangeAspect="1"/>
@@ -200,7 +209,7 @@
                   <pic:spPr>
                     <a:xfrm>
                       <a:off x="0" y="0"/>
-                      <a:ext cx="4572000" cy="2362200"/>
+                      <a:ext cx="3048000" cy="1574800"/>
                     </a:xfrm>
                     <a:prstGeom prst="rect">
                       <a:avLst/>
@@ -216,6 +225,7 @@
     <w:p>
       <w:pPr>
         <w:spacing w:before="220" w:after="90"/>
+        <w:keepNext/>
       </w:pPr>
       <w:r>
         <w:rPr>
@@ -232,6 +242,7 @@
     <w:p>
       <w:pPr>
         <w:spacing w:after="100"/>
+        <w:keepNext/>
       </w:pPr>
       <w:r>
         <w:rPr>
@@ -250,7 +261,7 @@
       <w:r>
         <w:drawing>
           <wp:inline distT="0" distB="0" distL="0" distR="0">
-            <wp:extent cx="1778000" cy="533400"/>
+            <wp:extent cx="1397000" cy="419100"/>
             <wp:docPr id="4" name="RusDox Signature 4" descr="Automated approval signature"/>
             <wp:cNvGraphicFramePr>
               <a:graphicFrameLocks noChangeAspect="1"/>
@@ -271,7 +282,7 @@
                   <pic:spPr>
                     <a:xfrm>
                       <a:off x="0" y="0"/>
-                      <a:ext cx="1778000" cy="533400"/>
+                      <a:ext cx="1397000" cy="419100"/>
                     </a:xfrm>
                     <a:prstGeom prst="rect">
                       <a:avLst/>

</xml_diff>